<commit_message>
Starting the work on report
</commit_message>
<xml_diff>
--- a/DSP REPORT.docx
+++ b/DSP REPORT.docx
@@ -193,6 +193,7 @@
     </w:p>
     <w:p>
       <w:pPr>
+        <w:jc w:val="center"/>
         <w:rPr>
           <w:rFonts w:eastAsia="source serif 4"/>
           <w:b/>
@@ -577,41 +578,45 @@
           <w:szCs w:val="28"/>
         </w:rPr>
       </w:pPr>
-      <w:proofErr w:type="gramStart"/>
       <w:r>
         <w:rPr>
           <w:b/>
           <w:bCs/>
           <w:szCs w:val="28"/>
         </w:rPr>
-        <w:t>FR.AGNEL</w:t>
-      </w:r>
-      <w:proofErr w:type="gramEnd"/>
+        <w:t>FR.</w:t>
+      </w:r>
       <w:r>
         <w:rPr>
           <w:b/>
           <w:bCs/>
           <w:szCs w:val="28"/>
         </w:rPr>
-        <w:t xml:space="preserve"> POLYTECHNIC </w:t>
-      </w:r>
-      <w:proofErr w:type="gramStart"/>
+        <w:t xml:space="preserve"> </w:t>
+      </w:r>
       <w:r>
         <w:rPr>
           <w:b/>
           <w:bCs/>
           <w:szCs w:val="28"/>
         </w:rPr>
-        <w:t>VASHI,NAVI</w:t>
-      </w:r>
-      <w:proofErr w:type="gramEnd"/>
+        <w:t>AGNEL POLYTECHNIC VASHI,</w:t>
+      </w:r>
       <w:r>
         <w:rPr>
           <w:b/>
           <w:bCs/>
           <w:szCs w:val="28"/>
         </w:rPr>
-        <w:t xml:space="preserve"> MUMBAI - 400703</w:t>
+        <w:t xml:space="preserve"> </w:t>
+      </w:r>
+      <w:r>
+        <w:rPr>
+          <w:b/>
+          <w:bCs/>
+          <w:szCs w:val="28"/>
+        </w:rPr>
+        <w:t>NAVI MUMBAI - 400703</w:t>
       </w:r>
     </w:p>
     <w:p>
@@ -714,7 +719,19 @@
               <w:rPr>
                 <w:color w:val="0070C0"/>
               </w:rPr>
-              <w:t xml:space="preserve">            NAME                                                                           ROLNO</w:t>
+              <w:t xml:space="preserve">            NAME                                                                           ROL</w:t>
+            </w:r>
+            <w:r>
+              <w:rPr>
+                <w:color w:val="0070C0"/>
+              </w:rPr>
+              <w:t xml:space="preserve">L </w:t>
+            </w:r>
+            <w:r>
+              <w:rPr>
+                <w:color w:val="0070C0"/>
+              </w:rPr>
+              <w:t>NO</w:t>
             </w:r>
           </w:p>
         </w:tc>
@@ -940,7 +957,27 @@
           <w:szCs w:val="24"/>
           <w:lang w:val="en-IN"/>
         </w:rPr>
-        <w:t xml:space="preserve">        </w:t>
+        <w:t xml:space="preserve">  </w:t>
+      </w:r>
+      <w:r>
+        <w:rPr>
+          <w:b/>
+          <w:bCs/>
+          <w:sz w:val="24"/>
+          <w:szCs w:val="24"/>
+          <w:lang w:val="en-IN"/>
+        </w:rPr>
+        <w:t xml:space="preserve">  </w:t>
+      </w:r>
+      <w:r>
+        <w:rPr>
+          <w:b/>
+          <w:bCs/>
+          <w:sz w:val="24"/>
+          <w:szCs w:val="24"/>
+          <w:lang w:val="en-IN"/>
+        </w:rPr>
+        <w:t xml:space="preserve">      </w:t>
       </w:r>
       <w:r>
         <w:rPr>
@@ -56665,6 +56702,7 @@
   <w:style w:type="character" w:default="1" w:styleId="DefaultParagraphFont">
     <w:name w:val="Default Paragraph Font"/>
     <w:uiPriority w:val="1"/>
+    <w:semiHidden/>
     <w:unhideWhenUsed/>
   </w:style>
   <w:style w:type="table" w:default="1" w:styleId="TableNormal">

</xml_diff>